<commit_message>
session3: master speaker 40 % on firmware 2.4.2 (skipped on 2.4.1), tones stay at volume 25
</commit_message>
<xml_diff>
--- a/s3/sf-s3-th.docx
+++ b/s3/sf-s3-th.docx
@@ -1816,7 +1816,41 @@
                 <w:b w:val="0"/>
                 <w:i w:val="0"/>
               </w:rPr>
-              <w:t xml:space="preserve"> (≈20%) ในส่วน 1</w:t>
+              <w:t xml:space="preserve"> (≈20%) ในส่วน 1 · ความดังลำโพงรวม </w:t>
+            </w:r>
+            <w:r>
+              <w:rPr>
+                <w:rFonts w:ascii="Consolas" w:hAnsi="Consolas" w:cs="Consolas" w:eastAsia="Consolas"/>
+                <w:b w:val="0"/>
+                <w:i w:val="0"/>
+                <w:sz w:val="21"/>
+              </w:rPr>
+              <w:t>SPEAKER = 40</w:t>
+            </w:r>
+            <w:r>
+              <w:rPr>
+                <w:rFonts w:ascii="TH Sarabun New" w:hAnsi="TH Sarabun New" w:cs="TH Sarabun New" w:eastAsia="TH Sarabun New"/>
+                <w:b w:val="0"/>
+                <w:i w:val="0"/>
+              </w:rPr>
+              <w:t xml:space="preserve"> (%) ผ่าน </w:t>
+            </w:r>
+            <w:r>
+              <w:rPr>
+                <w:rFonts w:ascii="Consolas" w:hAnsi="Consolas" w:cs="Consolas" w:eastAsia="Consolas"/>
+                <w:b w:val="0"/>
+                <w:i w:val="0"/>
+                <w:sz w:val="21"/>
+              </w:rPr>
+              <w:t>ui.volume()</w:t>
+            </w:r>
+            <w:r>
+              <w:rPr>
+                <w:rFonts w:ascii="TH Sarabun New" w:hAnsi="TH Sarabun New" w:cs="TH Sarabun New" w:eastAsia="TH Sarabun New"/>
+                <w:b w:val="0"/>
+                <w:i w:val="0"/>
+              </w:rPr>
+              <w:t xml:space="preserve"> (firmware 2.4.2 ขึ้นไป บอร์ด 2.4.1 ข้ามบรรทัดนี้เอง)</w:t>
             </w:r>
           </w:p>
         </w:tc>

</xml_diff>

<commit_message>
session3: Edge AI Store deploy, the on-board Edge AI menu, and AI results over MQTT
Slides and worksheet:
- New: deploy AnomalousVibration from the Edge AI Store Playground (Web
  Serial, IDE disconnected, menu STOPPED first), quoting the deploy dialog;
  the Store models that can be sent to the Dev Kit, which ones were measured
  there, and the CC-BY-NC-4.0 credit.
- New: the on-board Edge AI menu -- card, model list, Load, live results, Stop.
- New: sf3_06 as an extension -- change-plus-heartbeat publishing to
  bento-aiot/<TEAM>/ai, the course dashboard or mosquitto_sub, exercises.
- The code slide shows find_models() and MODEL_KEYS as in sf3_04.
- The app pump-off command now holds auto watering off for 30 s; TEAM must be
  team01-team99.
- Built-in models are credited to Imagimob DEEPCRAFT (Infineon).

No content slide scrolls at 1280x720.
</commit_message>
<xml_diff>
--- a/s3/sf-s3-th.docx
+++ b/s3/sf-s3-th.docx
@@ -3342,7 +3342,7 @@
                 <w:b w:val="0"/>
                 <w:i w:val="0"/>
               </w:rPr>
-              <w:t>กิจกรรม 4 Edge AI: AI หมอเครื่องจักร + แข่งกับกฎ (ทุกอย่างอยู่ในข้อ 6)</w:t>
+              <w:t>กิจกรรม 4 Edge AI: ส่งโมเดลจาก Edge AI Store · เมนู Edge AI บนบอร์ด · AI หมอเครื่องจักร + แข่งกับกฎ (ทุกอย่างอยู่ในข้อ 6)</w:t>
             </w:r>
           </w:p>
         </w:tc>
@@ -3372,7 +3372,41 @@
                 <w:i w:val="0"/>
                 <w:sz w:val="21"/>
               </w:rPr>
+              <w:t>edgeai-store.tesaiot.dev</w:t>
+            </w:r>
+            <w:r>
+              <w:rPr>
+                <w:rFonts w:ascii="TH Sarabun New" w:hAnsi="TH Sarabun New" w:cs="TH Sarabun New" w:eastAsia="TH Sarabun New"/>
+                <w:b w:val="0"/>
+                <w:i w:val="0"/>
+              </w:rPr>
+              <w:t xml:space="preserve"> · </w:t>
+            </w:r>
+            <w:r>
+              <w:rPr>
+                <w:rFonts w:ascii="Consolas" w:hAnsi="Consolas" w:cs="Consolas" w:eastAsia="Consolas"/>
+                <w:b w:val="0"/>
+                <w:i w:val="0"/>
+                <w:sz w:val="21"/>
+              </w:rPr>
               <w:t>s3/sf3_04_ai_pump_doctor.py</w:t>
+            </w:r>
+            <w:r>
+              <w:rPr>
+                <w:rFonts w:ascii="TH Sarabun New" w:hAnsi="TH Sarabun New" w:cs="TH Sarabun New" w:eastAsia="TH Sarabun New"/>
+                <w:b w:val="0"/>
+                <w:i w:val="0"/>
+              </w:rPr>
+              <w:t xml:space="preserve"> · ต่อยอด </w:t>
+            </w:r>
+            <w:r>
+              <w:rPr>
+                <w:rFonts w:ascii="Consolas" w:hAnsi="Consolas" w:cs="Consolas" w:eastAsia="Consolas"/>
+                <w:b w:val="0"/>
+                <w:i w:val="0"/>
+                <w:sz w:val="21"/>
+              </w:rPr>
+              <w:t>s3/sf3_06_ai_to_mqtt.py</w:t>
             </w:r>
           </w:p>
         </w:tc>
@@ -10699,7 +10733,7 @@
           <w:b w:val="0"/>
           <w:i w:val="0"/>
         </w:rPr>
-        <w:t xml:space="preserve"> ให้โมเดล AI ที่ติดมากับบอร์ดตัดสินแทนกฎ แล้วเปรียบเทียบกับกฎของกิจกรรม 3 บนโจทย์เดียวกันด้วยตัวเลขที่วัดเอง</w:t>
+        <w:t xml:space="preserve"> ส่งโมเดล AI ลงบอร์ดเองจาก Edge AI Store ให้ AI ตัดสินแทนกฎ แล้วเปรียบเทียบกับกฎของกิจกรรม 3 บนโจทย์เดียวกันด้วยตัวเลขที่วัดเอง</w:t>
       </w:r>
     </w:p>
     <w:p>
@@ -10709,182 +10743,15 @@
           <w:b/>
           <w:i w:val="0"/>
         </w:rPr>
-        <w:t>Edge AI ในไฟล์นี้:</w:t>
-      </w:r>
-      <w:r>
-        <w:rPr>
-          <w:rFonts w:ascii="TH Sarabun New" w:hAnsi="TH Sarabun New" w:cs="TH Sarabun New" w:eastAsia="TH Sarabun New"/>
-          <w:b w:val="0"/>
-          <w:i w:val="0"/>
-        </w:rPr>
-        <w:t xml:space="preserve"> ใช้เฉพาะโมเดลที่ติดมากับบอร์ด (DEEPCRAFT Ready Model) และเรียกด้วย </w:t>
-      </w:r>
-      <w:r>
-        <w:rPr>
-          <w:rFonts w:ascii="TH Sarabun New" w:hAnsi="TH Sarabun New" w:cs="TH Sarabun New" w:eastAsia="TH Sarabun New"/>
-          <w:b/>
-          <w:i w:val="0"/>
-        </w:rPr>
-        <w:t>ชื่อ</w:t>
-      </w:r>
-      <w:r>
-        <w:rPr>
-          <w:rFonts w:ascii="TH Sarabun New" w:hAnsi="TH Sarabun New" w:cs="TH Sarabun New" w:eastAsia="TH Sarabun New"/>
-          <w:b w:val="0"/>
-          <w:i w:val="0"/>
-        </w:rPr>
-        <w:t xml:space="preserve"> เท่านั้น — ตั้งไว้ที่ </w:t>
-      </w:r>
-      <w:r>
-        <w:rPr>
-          <w:rFonts w:ascii="Consolas" w:hAnsi="Consolas" w:cs="Consolas" w:eastAsia="Consolas"/>
-          <w:b w:val="0"/>
-          <w:i w:val="0"/>
-          <w:sz w:val="21"/>
-        </w:rPr>
-        <w:t>MODEL_KEY = "Motion"</w:t>
-      </w:r>
-      <w:r>
-        <w:rPr>
-          <w:rFonts w:ascii="TH Sarabun New" w:hAnsi="TH Sarabun New" w:cs="TH Sarabun New" w:eastAsia="TH Sarabun New"/>
-          <w:b w:val="0"/>
-          <w:i w:val="0"/>
-        </w:rPr>
-        <w:t xml:space="preserve"> · ไฟล์หาโมเดลด้วย </w:t>
-      </w:r>
-      <w:r>
-        <w:rPr>
-          <w:rFonts w:ascii="Consolas" w:hAnsi="Consolas" w:cs="Consolas" w:eastAsia="Consolas"/>
-          <w:b w:val="0"/>
-          <w:i w:val="0"/>
-          <w:sz w:val="21"/>
-        </w:rPr>
-        <w:t>edge_ai.models()</w:t>
-      </w:r>
-      <w:r>
-        <w:rPr>
-          <w:rFonts w:ascii="TH Sarabun New" w:hAnsi="TH Sarabun New" w:cs="TH Sarabun New" w:eastAsia="TH Sarabun New"/>
-          <w:b w:val="0"/>
-          <w:i w:val="0"/>
-        </w:rPr>
-        <w:t xml:space="preserve"> แล้วเก็บแค่ลำดับ ชื่อ และชื่อคลาส (ไม่พิมพ์ทั้งแถว) · เริ่มด้วย </w:t>
-      </w:r>
-      <w:r>
-        <w:rPr>
-          <w:rFonts w:ascii="Consolas" w:hAnsi="Consolas" w:cs="Consolas" w:eastAsia="Consolas"/>
-          <w:b w:val="0"/>
-          <w:i w:val="0"/>
-          <w:sz w:val="21"/>
-        </w:rPr>
-        <w:t>edge_ai.select(ลำดับ)</w:t>
-      </w:r>
-      <w:r>
-        <w:rPr>
-          <w:rFonts w:ascii="TH Sarabun New" w:hAnsi="TH Sarabun New" w:cs="TH Sarabun New" w:eastAsia="TH Sarabun New"/>
-          <w:b w:val="0"/>
-          <w:i w:val="0"/>
-        </w:rPr>
-        <w:t xml:space="preserve"> · อ่านคำตอบด้วย </w:t>
-      </w:r>
-      <w:r>
-        <w:rPr>
-          <w:rFonts w:ascii="Consolas" w:hAnsi="Consolas" w:cs="Consolas" w:eastAsia="Consolas"/>
-          <w:b w:val="0"/>
-          <w:i w:val="0"/>
-          <w:sz w:val="21"/>
-        </w:rPr>
-        <w:t>edge_ai.result()</w:t>
-      </w:r>
-      <w:r>
-        <w:rPr>
-          <w:rFonts w:ascii="TH Sarabun New" w:hAnsi="TH Sarabun New" w:cs="TH Sarabun New" w:eastAsia="TH Sarabun New"/>
-          <w:b w:val="0"/>
-          <w:i w:val="0"/>
-        </w:rPr>
-        <w:t xml:space="preserve"> · จบด้วย </w:t>
-      </w:r>
-      <w:r>
-        <w:rPr>
-          <w:rFonts w:ascii="Consolas" w:hAnsi="Consolas" w:cs="Consolas" w:eastAsia="Consolas"/>
-          <w:b w:val="0"/>
-          <w:i w:val="0"/>
-          <w:sz w:val="21"/>
-        </w:rPr>
-        <w:t>edge_ai.stop()</w:t>
-      </w:r>
-      <w:r>
-        <w:rPr>
-          <w:rFonts w:ascii="TH Sarabun New" w:hAnsi="TH Sarabun New" w:cs="TH Sarabun New" w:eastAsia="TH Sarabun New"/>
-          <w:b w:val="0"/>
-          <w:i w:val="0"/>
-        </w:rPr>
-        <w:t xml:space="preserve"> · ตัวกันเตือนผิด = </w:t>
-      </w:r>
-      <w:r>
-        <w:rPr>
-          <w:rFonts w:ascii="TH Sarabun New" w:hAnsi="TH Sarabun New" w:cs="TH Sarabun New" w:eastAsia="TH Sarabun New"/>
-          <w:b/>
-          <w:i w:val="0"/>
-        </w:rPr>
-        <w:t>ความมั่นใจขั้นต่ำ</w:t>
-      </w:r>
-      <w:r>
-        <w:rPr>
-          <w:rFonts w:ascii="TH Sarabun New" w:hAnsi="TH Sarabun New" w:cs="TH Sarabun New" w:eastAsia="TH Sarabun New"/>
-          <w:b w:val="0"/>
-          <w:i w:val="0"/>
-        </w:rPr>
-        <w:t xml:space="preserve"> </w:t>
-      </w:r>
-      <w:r>
-        <w:rPr>
-          <w:rFonts w:ascii="Consolas" w:hAnsi="Consolas" w:cs="Consolas" w:eastAsia="Consolas"/>
-          <w:b w:val="0"/>
-          <w:i w:val="0"/>
-          <w:sz w:val="21"/>
-        </w:rPr>
-        <w:t>CONF_MIN</w:t>
-      </w:r>
-      <w:r>
-        <w:rPr>
-          <w:rFonts w:ascii="TH Sarabun New" w:hAnsi="TH Sarabun New" w:cs="TH Sarabun New" w:eastAsia="TH Sarabun New"/>
-          <w:b w:val="0"/>
-          <w:i w:val="0"/>
-        </w:rPr>
-        <w:t xml:space="preserve"> + </w:t>
-      </w:r>
-      <w:r>
-        <w:rPr>
-          <w:rFonts w:ascii="TH Sarabun New" w:hAnsi="TH Sarabun New" w:cs="TH Sarabun New" w:eastAsia="TH Sarabun New"/>
-          <w:b/>
-          <w:i w:val="0"/>
-        </w:rPr>
-        <w:t>คลาสอันตรายต้องชนะติดกัน</w:t>
-      </w:r>
-      <w:r>
-        <w:rPr>
-          <w:rFonts w:ascii="TH Sarabun New" w:hAnsi="TH Sarabun New" w:cs="TH Sarabun New" w:eastAsia="TH Sarabun New"/>
-          <w:b w:val="0"/>
-          <w:i w:val="0"/>
-        </w:rPr>
-        <w:t xml:space="preserve"> </w:t>
-      </w:r>
-      <w:r>
-        <w:rPr>
-          <w:rFonts w:ascii="Consolas" w:hAnsi="Consolas" w:cs="Consolas" w:eastAsia="Consolas"/>
-          <w:b w:val="0"/>
-          <w:i w:val="0"/>
-          <w:sz w:val="21"/>
-        </w:rPr>
-        <w:t>CONFIRM_N</w:t>
-      </w:r>
-      <w:r>
-        <w:rPr>
-          <w:rFonts w:ascii="TH Sarabun New" w:hAnsi="TH Sarabun New" w:cs="TH Sarabun New" w:eastAsia="TH Sarabun New"/>
-          <w:b w:val="0"/>
-          <w:i w:val="0"/>
-        </w:rPr>
-        <w:t xml:space="preserve"> ครั้ง</w:t>
+        <w:t>6.1 ส่งโมเดลลงบอร์ดจาก Edge AI Store</w:t>
+      </w:r>
+      <w:r>
+        <w:rPr>
+          <w:rFonts w:ascii="TH Sarabun New" w:hAnsi="TH Sarabun New" w:cs="TH Sarabun New" w:eastAsia="TH Sarabun New"/>
+          <w:b w:val="0"/>
+          <w:i w:val="0"/>
+        </w:rPr>
+        <w:t xml:space="preserve"> (ทีม 1–10 ก่อน ทีม 11–20 รอผู้สอนเรียก · ระหว่างรอทำข้อ 6.2 กับ Motion Detection ไปก่อน)</w:t>
       </w:r>
     </w:p>
     <w:p>
@@ -10898,7 +10765,39 @@
           <w:b w:val="0"/>
           <w:i w:val="0"/>
         </w:rPr>
-        <w:t>[ ] รันไฟล์ แถวบนจอขึ้น "โมเดล: ____________________" (โมเดลที่ฟังไมค์จะมี "(ฟังไมค์)" ต่อท้าย) · ชื่อคลาสในการ์ด "คะแนนทุกคลาส (%)": ____________________</w:t>
+        <w:t xml:space="preserve">[ ] เมนู Edge AI บนบอร์ดต้องขึ้น </w:t>
+      </w:r>
+      <w:r>
+        <w:rPr>
+          <w:rFonts w:ascii="TH Sarabun New" w:hAnsi="TH Sarabun New" w:cs="TH Sarabun New" w:eastAsia="TH Sarabun New"/>
+          <w:b/>
+          <w:i w:val="0"/>
+        </w:rPr>
+        <w:t>STOPPED</w:t>
+      </w:r>
+      <w:r>
+        <w:rPr>
+          <w:rFonts w:ascii="TH Sarabun New" w:hAnsi="TH Sarabun New" w:cs="TH Sarabun New" w:eastAsia="TH Sarabun New"/>
+          <w:b w:val="0"/>
+          <w:i w:val="0"/>
+        </w:rPr>
+        <w:t xml:space="preserve"> (ถ้ายังรันอยู่ กด Stop) · ใน BENTO IDE กด </w:t>
+      </w:r>
+      <w:r>
+        <w:rPr>
+          <w:rFonts w:ascii="TH Sarabun New" w:hAnsi="TH Sarabun New" w:cs="TH Sarabun New" w:eastAsia="TH Sarabun New"/>
+          <w:b/>
+          <w:i w:val="0"/>
+        </w:rPr>
+        <w:t>Disconnect</w:t>
+      </w:r>
+      <w:r>
+        <w:rPr>
+          <w:rFonts w:ascii="TH Sarabun New" w:hAnsi="TH Sarabun New" w:cs="TH Sarabun New" w:eastAsia="TH Sarabun New"/>
+          <w:b w:val="0"/>
+          <w:i w:val="0"/>
+        </w:rPr>
+        <w:t xml:space="preserve"> (พอร์ตของบอร์ดใช้ได้ทีละโปรแกรม)</w:t>
       </w:r>
     </w:p>
     <w:p>
@@ -10912,7 +10811,731 @@
           <w:b w:val="0"/>
           <w:i w:val="0"/>
         </w:rPr>
-        <w:t>[ ] ☐ จอขึ้น "ไม่พบโมเดล Motion บนบอร์ดนี้" → ข้ามคอลัมน์ AI ในตารางแข่ง (ขอดูบอร์ดของกลุ่มข้าง ๆ ได้) แล้วทำ Code Quest ด้านล่างต่อ ไม่ต้องรอใคร</w:t>
+        <w:t xml:space="preserve">[ ] เปิด </w:t>
+      </w:r>
+      <w:r>
+        <w:rPr>
+          <w:rFonts w:ascii="TH Sarabun New" w:hAnsi="TH Sarabun New" w:cs="TH Sarabun New" w:eastAsia="TH Sarabun New"/>
+          <w:b/>
+          <w:i w:val="0"/>
+        </w:rPr>
+        <w:t>Google Chrome</w:t>
+      </w:r>
+      <w:r>
+        <w:rPr>
+          <w:rFonts w:ascii="TH Sarabun New" w:hAnsi="TH Sarabun New" w:cs="TH Sarabun New" w:eastAsia="TH Sarabun New"/>
+          <w:b w:val="0"/>
+          <w:i w:val="0"/>
+        </w:rPr>
+        <w:t xml:space="preserve"> บนคอมพิวเตอร์ ไปที่ </w:t>
+      </w:r>
+      <w:r>
+        <w:rPr>
+          <w:rFonts w:ascii="Consolas" w:hAnsi="Consolas" w:cs="Consolas" w:eastAsia="Consolas"/>
+          <w:b w:val="0"/>
+          <w:i w:val="0"/>
+          <w:sz w:val="21"/>
+        </w:rPr>
+        <w:t>edgeai-store.tesaiot.dev</w:t>
+      </w:r>
+      <w:r>
+        <w:rPr>
+          <w:rFonts w:ascii="TH Sarabun New" w:hAnsi="TH Sarabun New" w:cs="TH Sarabun New" w:eastAsia="TH Sarabun New"/>
+          <w:b w:val="0"/>
+          <w:i w:val="0"/>
+        </w:rPr>
+        <w:t xml:space="preserve"> แล้วเปิดหน้า </w:t>
+      </w:r>
+      <w:r>
+        <w:rPr>
+          <w:rFonts w:ascii="TH Sarabun New" w:hAnsi="TH Sarabun New" w:cs="TH Sarabun New" w:eastAsia="TH Sarabun New"/>
+          <w:b/>
+          <w:i w:val="0"/>
+        </w:rPr>
+        <w:t>Playground</w:t>
+      </w:r>
+      <w:r>
+        <w:rPr>
+          <w:rFonts w:ascii="TH Sarabun New" w:hAnsi="TH Sarabun New" w:cs="TH Sarabun New" w:eastAsia="TH Sarabun New"/>
+          <w:b w:val="0"/>
+          <w:i w:val="0"/>
+        </w:rPr>
+        <w:t xml:space="preserve"> (ไม่ใช่ </w:t>
+      </w:r>
+      <w:r>
+        <w:rPr>
+          <w:rFonts w:ascii="Consolas" w:hAnsi="Consolas" w:cs="Consolas" w:eastAsia="Consolas"/>
+          <w:b w:val="0"/>
+          <w:i w:val="0"/>
+          <w:sz w:val="21"/>
+        </w:rPr>
+        <w:t>edgeai.tesaiot.dev</w:t>
+      </w:r>
+      <w:r>
+        <w:rPr>
+          <w:rFonts w:ascii="TH Sarabun New" w:hAnsi="TH Sarabun New" w:cs="TH Sarabun New" w:eastAsia="TH Sarabun New"/>
+          <w:b w:val="0"/>
+          <w:i w:val="0"/>
+        </w:rPr>
+        <w:t xml:space="preserve"> ซึ่งเป็นคนละระบบ)</w:t>
+      </w:r>
+    </w:p>
+    <w:p>
+      <w:pPr>
+        <w:pStyle w:val="ListBullet"/>
+        <w:spacing w:after="60"/>
+      </w:pPr>
+      <w:r>
+        <w:rPr>
+          <w:rFonts w:ascii="TH Sarabun New" w:hAnsi="TH Sarabun New" w:cs="TH Sarabun New" w:eastAsia="TH Sarabun New"/>
+          <w:b w:val="0"/>
+          <w:i w:val="0"/>
+        </w:rPr>
+        <w:t>[ ] กดติดตั้ง (</w:t>
+      </w:r>
+      <w:r>
+        <w:rPr>
+          <w:rFonts w:ascii="TH Sarabun New" w:hAnsi="TH Sarabun New" w:cs="TH Sarabun New" w:eastAsia="TH Sarabun New"/>
+          <w:b/>
+          <w:i w:val="0"/>
+        </w:rPr>
+        <w:t>Deploy</w:t>
+      </w:r>
+      <w:r>
+        <w:rPr>
+          <w:rFonts w:ascii="TH Sarabun New" w:hAnsi="TH Sarabun New" w:cs="TH Sarabun New" w:eastAsia="TH Sarabun New"/>
+          <w:b w:val="0"/>
+          <w:i w:val="0"/>
+        </w:rPr>
+        <w:t xml:space="preserve">) ที่โมเดล </w:t>
+      </w:r>
+      <w:r>
+        <w:rPr>
+          <w:rFonts w:ascii="TH Sarabun New" w:hAnsi="TH Sarabun New" w:cs="TH Sarabun New" w:eastAsia="TH Sarabun New"/>
+          <w:b/>
+          <w:i w:val="0"/>
+        </w:rPr>
+        <w:t>AnomalousVibration</w:t>
+      </w:r>
+      <w:r>
+        <w:rPr>
+          <w:rFonts w:ascii="TH Sarabun New" w:hAnsi="TH Sarabun New" w:cs="TH Sarabun New" w:eastAsia="TH Sarabun New"/>
+          <w:b w:val="0"/>
+          <w:i w:val="0"/>
+        </w:rPr>
+        <w:t xml:space="preserve"> (IMU · คลาส </w:t>
+      </w:r>
+      <w:r>
+        <w:rPr>
+          <w:rFonts w:ascii="Consolas" w:hAnsi="Consolas" w:cs="Consolas" w:eastAsia="Consolas"/>
+          <w:b w:val="0"/>
+          <w:i w:val="0"/>
+          <w:sz w:val="21"/>
+        </w:rPr>
+        <w:t>unlabeled</w:t>
+      </w:r>
+      <w:r>
+        <w:rPr>
+          <w:rFonts w:ascii="TH Sarabun New" w:hAnsi="TH Sarabun New" w:cs="TH Sarabun New" w:eastAsia="TH Sarabun New"/>
+          <w:b w:val="0"/>
+          <w:i w:val="0"/>
+        </w:rPr>
+        <w:t xml:space="preserve"> </w:t>
+      </w:r>
+      <w:r>
+        <w:rPr>
+          <w:rFonts w:ascii="Consolas" w:hAnsi="Consolas" w:cs="Consolas" w:eastAsia="Consolas"/>
+          <w:b w:val="0"/>
+          <w:i w:val="0"/>
+          <w:sz w:val="21"/>
+        </w:rPr>
+        <w:t>anomaly</w:t>
+      </w:r>
+      <w:r>
+        <w:rPr>
+          <w:rFonts w:ascii="TH Sarabun New" w:hAnsi="TH Sarabun New" w:cs="TH Sarabun New" w:eastAsia="TH Sarabun New"/>
+          <w:b w:val="0"/>
+          <w:i w:val="0"/>
+        </w:rPr>
+        <w:t>) · ถ้า Chrome ถามพอร์ต เลือกพอร์ตของบอร์ด · ห้ามถอดสาย USB ระหว่างส่ง</w:t>
+      </w:r>
+    </w:p>
+    <w:p>
+      <w:pPr>
+        <w:pStyle w:val="ListBullet"/>
+        <w:spacing w:after="60"/>
+      </w:pPr>
+      <w:r>
+        <w:rPr>
+          <w:rFonts w:ascii="TH Sarabun New" w:hAnsi="TH Sarabun New" w:cs="TH Sarabun New" w:eastAsia="TH Sarabun New"/>
+          <w:b w:val="0"/>
+          <w:i w:val="0"/>
+        </w:rPr>
+        <w:t xml:space="preserve">[ ] หน้าต่างขึ้น </w:t>
+      </w:r>
+      <w:r>
+        <w:rPr>
+          <w:rFonts w:ascii="TH Sarabun New" w:hAnsi="TH Sarabun New" w:cs="TH Sarabun New" w:eastAsia="TH Sarabun New"/>
+          <w:b/>
+          <w:i w:val="0"/>
+        </w:rPr>
+        <w:t>"Loaded onto the board"</w:t>
+      </w:r>
+      <w:r>
+        <w:rPr>
+          <w:rFonts w:ascii="TH Sarabun New" w:hAnsi="TH Sarabun New" w:cs="TH Sarabun New" w:eastAsia="TH Sarabun New"/>
+          <w:b w:val="0"/>
+          <w:i w:val="0"/>
+        </w:rPr>
+        <w:t xml:space="preserve"> และ </w:t>
+      </w:r>
+      <w:r>
+        <w:rPr>
+          <w:rFonts w:ascii="TH Sarabun New" w:hAnsi="TH Sarabun New" w:cs="TH Sarabun New" w:eastAsia="TH Sarabun New"/>
+          <w:b/>
+          <w:i w:val="0"/>
+        </w:rPr>
+        <w:t>"Saved to the board and loaded"</w:t>
+      </w:r>
+      <w:r>
+        <w:rPr>
+          <w:rFonts w:ascii="TH Sarabun New" w:hAnsi="TH Sarabun New" w:cs="TH Sarabun New" w:eastAsia="TH Sarabun New"/>
+          <w:b w:val="0"/>
+          <w:i w:val="0"/>
+        </w:rPr>
+        <w:t xml:space="preserve"> ☐ แล้วกด </w:t>
+      </w:r>
+      <w:r>
+        <w:rPr>
+          <w:rFonts w:ascii="TH Sarabun New" w:hAnsi="TH Sarabun New" w:cs="TH Sarabun New" w:eastAsia="TH Sarabun New"/>
+          <w:b/>
+          <w:i w:val="0"/>
+        </w:rPr>
+        <w:t>Close</w:t>
+      </w:r>
+    </w:p>
+    <w:p>
+      <w:pPr>
+        <w:pStyle w:val="ListBullet"/>
+        <w:spacing w:after="60"/>
+      </w:pPr>
+      <w:r>
+        <w:rPr>
+          <w:rFonts w:ascii="TH Sarabun New" w:hAnsi="TH Sarabun New" w:cs="TH Sarabun New" w:eastAsia="TH Sarabun New"/>
+          <w:b w:val="0"/>
+          <w:i w:val="0"/>
+        </w:rPr>
+        <w:t xml:space="preserve">[ ] </w:t>
+      </w:r>
+      <w:r>
+        <w:rPr>
+          <w:rFonts w:ascii="TH Sarabun New" w:hAnsi="TH Sarabun New" w:cs="TH Sarabun New" w:eastAsia="TH Sarabun New"/>
+          <w:b/>
+          <w:i w:val="0"/>
+        </w:rPr>
+        <w:t>ปิดแท็บ Store</w:t>
+      </w:r>
+      <w:r>
+        <w:rPr>
+          <w:rFonts w:ascii="TH Sarabun New" w:hAnsi="TH Sarabun New" w:cs="TH Sarabun New" w:eastAsia="TH Sarabun New"/>
+          <w:b w:val="0"/>
+          <w:i w:val="0"/>
+        </w:rPr>
+        <w:t xml:space="preserve"> ก่อนกลับไปต่อ BENTO IDE · โมเดลถูกบันทึกลงบอร์ด ถอดปลั๊กแล้วยังอยู่ (ทดสอบบน Dev Kit เฟิร์มแวร์ 2.4.2 แล้ว)</w:t>
+      </w:r>
+    </w:p>
+    <w:p>
+      <w:pPr>
+        <w:keepLines/>
+        <w:pBdr>
+          <w:left w:val="single" w:sz="18" w:space="8" w:color="2E5496"/>
+        </w:pBdr>
+        <w:shd w:val="clear" w:fill="F1F5FB"/>
+        <w:spacing w:before="120" w:after="160" w:line="274" w:lineRule="auto"/>
+        <w:ind w:left="283" w:right="113"/>
+      </w:pPr>
+      <w:r>
+        <w:rPr>
+          <w:rFonts w:ascii="TH Sarabun New" w:hAnsi="TH Sarabun New" w:cs="TH Sarabun New" w:eastAsia="TH Sarabun New"/>
+          <w:b w:val="0"/>
+          <w:i/>
+          <w:color w:val="5B616B"/>
+        </w:rPr>
+        <w:t xml:space="preserve">โมเดลใน Store เป็นของ Infineon Technologies AG / Imagimob DEEPCRAFT Studio accelerators สัญญาอนุญาต </w:t>
+      </w:r>
+      <w:r>
+        <w:rPr>
+          <w:rFonts w:ascii="TH Sarabun New" w:hAnsi="TH Sarabun New" w:cs="TH Sarabun New" w:eastAsia="TH Sarabun New"/>
+          <w:b/>
+          <w:i/>
+          <w:color w:val="5B616B"/>
+        </w:rPr>
+        <w:t>CC-BY-NC-4.0</w:t>
+      </w:r>
+      <w:r>
+        <w:rPr>
+          <w:rFonts w:ascii="TH Sarabun New" w:hAnsi="TH Sarabun New" w:cs="TH Sarabun New" w:eastAsia="TH Sarabun New"/>
+          <w:b w:val="0"/>
+          <w:i/>
+          <w:color w:val="5B616B"/>
+        </w:rPr>
+        <w:t xml:space="preserve">: ใช้เรียนได้ ห้ามใช้เชิงพาณิชย์ และต้องให้เครดิตเมื่อใช้ในโปรเจกต์ · ในห้องและในโปรเจกต์ให้ใช้ </w:t>
+      </w:r>
+      <w:r>
+        <w:rPr>
+          <w:rFonts w:ascii="TH Sarabun New" w:hAnsi="TH Sarabun New" w:cs="TH Sarabun New" w:eastAsia="TH Sarabun New"/>
+          <w:b/>
+          <w:i/>
+          <w:color w:val="5B616B"/>
+        </w:rPr>
+        <w:t>AnomalousVibration</w:t>
+      </w:r>
+      <w:r>
+        <w:rPr>
+          <w:rFonts w:ascii="TH Sarabun New" w:hAnsi="TH Sarabun New" w:cs="TH Sarabun New" w:eastAsia="TH Sarabun New"/>
+          <w:b w:val="0"/>
+          <w:i/>
+          <w:color w:val="5B616B"/>
+        </w:rPr>
+        <w:t xml:space="preserve"> (ทดสอบผลบน Dev Kit แล้ว) · </w:t>
+      </w:r>
+      <w:r>
+        <w:rPr>
+          <w:rFonts w:ascii="TH Sarabun New" w:hAnsi="TH Sarabun New" w:cs="TH Sarabun New" w:eastAsia="TH Sarabun New"/>
+          <w:b/>
+          <w:i/>
+          <w:color w:val="5B616B"/>
+        </w:rPr>
+        <w:t>HumanActivity</w:t>
+      </w:r>
+      <w:r>
+        <w:rPr>
+          <w:rFonts w:ascii="TH Sarabun New" w:hAnsi="TH Sarabun New" w:cs="TH Sarabun New" w:eastAsia="TH Sarabun New"/>
+          <w:b w:val="0"/>
+          <w:i/>
+          <w:color w:val="5B616B"/>
+        </w:rPr>
+        <w:t xml:space="preserve"> (IMU: standing · running · walking · sitting · jumping) · </w:t>
+      </w:r>
+      <w:r>
+        <w:rPr>
+          <w:rFonts w:ascii="TH Sarabun New" w:hAnsi="TH Sarabun New" w:cs="TH Sarabun New" w:eastAsia="TH Sarabun New"/>
+          <w:b/>
+          <w:i/>
+          <w:color w:val="5B616B"/>
+        </w:rPr>
+        <w:t>SurfaceMic</w:t>
+      </w:r>
+      <w:r>
+        <w:rPr>
+          <w:rFonts w:ascii="TH Sarabun New" w:hAnsi="TH Sarabun New" w:cs="TH Sarabun New" w:eastAsia="TH Sarabun New"/>
+          <w:b w:val="0"/>
+          <w:i/>
+          <w:color w:val="5B616B"/>
+        </w:rPr>
+        <w:t xml:space="preserve"> · </w:t>
+      </w:r>
+      <w:r>
+        <w:rPr>
+          <w:rFonts w:ascii="TH Sarabun New" w:hAnsi="TH Sarabun New" w:cs="TH Sarabun New" w:eastAsia="TH Sarabun New"/>
+          <w:b/>
+          <w:i/>
+          <w:color w:val="5B616B"/>
+        </w:rPr>
+        <w:t>HomeSounds</w:t>
+      </w:r>
+      <w:r>
+        <w:rPr>
+          <w:rFonts w:ascii="TH Sarabun New" w:hAnsi="TH Sarabun New" w:cs="TH Sarabun New" w:eastAsia="TH Sarabun New"/>
+          <w:b w:val="0"/>
+          <w:i/>
+          <w:color w:val="5B616B"/>
+        </w:rPr>
+        <w:t xml:space="preserve"> (สามตัวหลังติดตั้งได้ แต่ผลบน Dev Kit ยังไม่ได้วัด — ลองแล้วจดผลเอง) · FallDetection ติดตั้งได้ แต่ผลบน Dev Kit ยังไม่น่าเชื่อถือ</w:t>
+      </w:r>
+    </w:p>
+    <w:p>
+      <w:r>
+        <w:rPr>
+          <w:rFonts w:ascii="TH Sarabun New" w:hAnsi="TH Sarabun New" w:cs="TH Sarabun New" w:eastAsia="TH Sarabun New"/>
+          <w:b/>
+          <w:i w:val="0"/>
+        </w:rPr>
+        <w:t>6.2 ลองโมเดลจากเมนูบนจอบอร์ด (ไม่ต้องเขียนโค้ด)</w:t>
+      </w:r>
+    </w:p>
+    <w:p>
+      <w:pPr>
+        <w:pStyle w:val="ListBullet"/>
+        <w:spacing w:after="60"/>
+      </w:pPr>
+      <w:r>
+        <w:rPr>
+          <w:rFonts w:ascii="TH Sarabun New" w:hAnsi="TH Sarabun New" w:cs="TH Sarabun New" w:eastAsia="TH Sarabun New"/>
+          <w:b w:val="0"/>
+          <w:i w:val="0"/>
+        </w:rPr>
+        <w:t xml:space="preserve">[ ] หน้าแรกของบอร์ด แตะการ์ด </w:t>
+      </w:r>
+      <w:r>
+        <w:rPr>
+          <w:rFonts w:ascii="TH Sarabun New" w:hAnsi="TH Sarabun New" w:cs="TH Sarabun New" w:eastAsia="TH Sarabun New"/>
+          <w:b/>
+          <w:i w:val="0"/>
+        </w:rPr>
+        <w:t>Edge AI</w:t>
+      </w:r>
+      <w:r>
+        <w:rPr>
+          <w:rFonts w:ascii="TH Sarabun New" w:hAnsi="TH Sarabun New" w:cs="TH Sarabun New" w:eastAsia="TH Sarabun New"/>
+          <w:b w:val="0"/>
+          <w:i w:val="0"/>
+        </w:rPr>
+        <w:t xml:space="preserve"> → แตะรายการโมเดล เลือก </w:t>
+      </w:r>
+      <w:r>
+        <w:rPr>
+          <w:rFonts w:ascii="TH Sarabun New" w:hAnsi="TH Sarabun New" w:cs="TH Sarabun New" w:eastAsia="TH Sarabun New"/>
+          <w:b/>
+          <w:i w:val="0"/>
+        </w:rPr>
+        <w:t>AnomalousVibration</w:t>
+      </w:r>
+      <w:r>
+        <w:rPr>
+          <w:rFonts w:ascii="TH Sarabun New" w:hAnsi="TH Sarabun New" w:cs="TH Sarabun New" w:eastAsia="TH Sarabun New"/>
+          <w:b w:val="0"/>
+          <w:i w:val="0"/>
+        </w:rPr>
+        <w:t xml:space="preserve"> (กลุ่ม IMU ต่อจากโมเดลในตัว · ยังไม่เห็นให้ออกจากเมนูแล้วเปิดใหม่ · ยังไม่ได้ส่ง → </w:t>
+      </w:r>
+      <w:r>
+        <w:rPr>
+          <w:rFonts w:ascii="TH Sarabun New" w:hAnsi="TH Sarabun New" w:cs="TH Sarabun New" w:eastAsia="TH Sarabun New"/>
+          <w:b/>
+          <w:i w:val="0"/>
+        </w:rPr>
+        <w:t>Motion Detection</w:t>
+      </w:r>
+      <w:r>
+        <w:rPr>
+          <w:rFonts w:ascii="TH Sarabun New" w:hAnsi="TH Sarabun New" w:cs="TH Sarabun New" w:eastAsia="TH Sarabun New"/>
+          <w:b w:val="0"/>
+          <w:i w:val="0"/>
+        </w:rPr>
+        <w:t xml:space="preserve">) → กดปุ่มเขียว </w:t>
+      </w:r>
+      <w:r>
+        <w:rPr>
+          <w:rFonts w:ascii="TH Sarabun New" w:hAnsi="TH Sarabun New" w:cs="TH Sarabun New" w:eastAsia="TH Sarabun New"/>
+          <w:b/>
+          <w:i w:val="0"/>
+        </w:rPr>
+        <w:t>Load</w:t>
+      </w:r>
+      <w:r>
+        <w:rPr>
+          <w:rFonts w:ascii="TH Sarabun New" w:hAnsi="TH Sarabun New" w:cs="TH Sarabun New" w:eastAsia="TH Sarabun New"/>
+          <w:b w:val="0"/>
+          <w:i w:val="0"/>
+        </w:rPr>
+        <w:t xml:space="preserve"> จนป้ายสถานะเป็น </w:t>
+      </w:r>
+      <w:r>
+        <w:rPr>
+          <w:rFonts w:ascii="TH Sarabun New" w:hAnsi="TH Sarabun New" w:cs="TH Sarabun New" w:eastAsia="TH Sarabun New"/>
+          <w:b/>
+          <w:i w:val="0"/>
+        </w:rPr>
+        <w:t>RUNNING</w:t>
+      </w:r>
+    </w:p>
+    <w:p>
+      <w:pPr>
+        <w:pStyle w:val="ListBullet"/>
+        <w:spacing w:after="60"/>
+      </w:pPr>
+      <w:r>
+        <w:rPr>
+          <w:rFonts w:ascii="TH Sarabun New" w:hAnsi="TH Sarabun New" w:cs="TH Sarabun New" w:eastAsia="TH Sarabun New"/>
+          <w:b w:val="0"/>
+          <w:i w:val="0"/>
+        </w:rPr>
+        <w:t xml:space="preserve">[ ] วางนิ่ง → เคาะโต๊ะ → เขย่า · คลาสที่ชนะตอนเขย่า: ________ (มั่นใจ ____ %) · </w:t>
+      </w:r>
+      <w:r>
+        <w:rPr>
+          <w:rFonts w:ascii="Consolas" w:hAnsi="Consolas" w:cs="Consolas" w:eastAsia="Consolas"/>
+          <w:b w:val="0"/>
+          <w:i w:val="0"/>
+          <w:sz w:val="21"/>
+        </w:rPr>
+        <w:t>inference:</w:t>
+      </w:r>
+      <w:r>
+        <w:rPr>
+          <w:rFonts w:ascii="TH Sarabun New" w:hAnsi="TH Sarabun New" w:cs="TH Sarabun New" w:eastAsia="TH Sarabun New"/>
+          <w:b w:val="0"/>
+          <w:i w:val="0"/>
+        </w:rPr>
+        <w:t xml:space="preserve"> ประมาณ ______ ms</w:t>
+      </w:r>
+    </w:p>
+    <w:p>
+      <w:pPr>
+        <w:pStyle w:val="ListBullet"/>
+        <w:spacing w:after="60"/>
+      </w:pPr>
+      <w:r>
+        <w:rPr>
+          <w:rFonts w:ascii="TH Sarabun New" w:hAnsi="TH Sarabun New" w:cs="TH Sarabun New" w:eastAsia="TH Sarabun New"/>
+          <w:b w:val="0"/>
+          <w:i w:val="0"/>
+        </w:rPr>
+        <w:t xml:space="preserve">[ ] กดปุ่มเดิมซึ่งตอนนี้เป็น </w:t>
+      </w:r>
+      <w:r>
+        <w:rPr>
+          <w:rFonts w:ascii="TH Sarabun New" w:hAnsi="TH Sarabun New" w:cs="TH Sarabun New" w:eastAsia="TH Sarabun New"/>
+          <w:b/>
+          <w:i w:val="0"/>
+        </w:rPr>
+        <w:t>Stop</w:t>
+      </w:r>
+      <w:r>
+        <w:rPr>
+          <w:rFonts w:ascii="TH Sarabun New" w:hAnsi="TH Sarabun New" w:cs="TH Sarabun New" w:eastAsia="TH Sarabun New"/>
+          <w:b w:val="0"/>
+          <w:i w:val="0"/>
+        </w:rPr>
+        <w:t xml:space="preserve"> สีแดง ☐ (ออกจากหน้านี้เฉย ๆ โมเดลยังรันต่อ)</w:t>
+      </w:r>
+    </w:p>
+    <w:p>
+      <w:r>
+        <w:rPr>
+          <w:rFonts w:ascii="TH Sarabun New" w:hAnsi="TH Sarabun New" w:cs="TH Sarabun New" w:eastAsia="TH Sarabun New"/>
+          <w:b/>
+          <w:i w:val="0"/>
+        </w:rPr>
+        <w:t>6.3 ให้ไฟล์ของเราเรียกโมเดล:</w:t>
+      </w:r>
+      <w:r>
+        <w:rPr>
+          <w:rFonts w:ascii="TH Sarabun New" w:hAnsi="TH Sarabun New" w:cs="TH Sarabun New" w:eastAsia="TH Sarabun New"/>
+          <w:b w:val="0"/>
+          <w:i w:val="0"/>
+        </w:rPr>
+        <w:t xml:space="preserve"> ไฟล์เรียกโมเดลด้วย </w:t>
+      </w:r>
+      <w:r>
+        <w:rPr>
+          <w:rFonts w:ascii="TH Sarabun New" w:hAnsi="TH Sarabun New" w:cs="TH Sarabun New" w:eastAsia="TH Sarabun New"/>
+          <w:b/>
+          <w:i w:val="0"/>
+        </w:rPr>
+        <w:t>ชื่อ</w:t>
+      </w:r>
+      <w:r>
+        <w:rPr>
+          <w:rFonts w:ascii="TH Sarabun New" w:hAnsi="TH Sarabun New" w:cs="TH Sarabun New" w:eastAsia="TH Sarabun New"/>
+          <w:b w:val="0"/>
+          <w:i w:val="0"/>
+        </w:rPr>
+        <w:t xml:space="preserve"> เท่านั้น ตามลำดับใน </w:t>
+      </w:r>
+      <w:r>
+        <w:rPr>
+          <w:rFonts w:ascii="Consolas" w:hAnsi="Consolas" w:cs="Consolas" w:eastAsia="Consolas"/>
+          <w:b w:val="0"/>
+          <w:i w:val="0"/>
+          <w:sz w:val="21"/>
+        </w:rPr>
+        <w:t>MODEL_KEYS = ("AnomalousVibration", "Motion")</w:t>
+      </w:r>
+      <w:r>
+        <w:rPr>
+          <w:rFonts w:ascii="TH Sarabun New" w:hAnsi="TH Sarabun New" w:cs="TH Sarabun New" w:eastAsia="TH Sarabun New"/>
+          <w:b w:val="0"/>
+          <w:i w:val="0"/>
+        </w:rPr>
+        <w:t xml:space="preserve"> — AnomalousVibration ก่อน ถ้าไม่มีหรือเลือกไม่สำเร็จจึงใช้ Motion ที่ติดมากับบอร์ด (Imagimob DEEPCRAFT ของ Infineon) · ไฟล์หาโมเดลด้วย </w:t>
+      </w:r>
+      <w:r>
+        <w:rPr>
+          <w:rFonts w:ascii="Consolas" w:hAnsi="Consolas" w:cs="Consolas" w:eastAsia="Consolas"/>
+          <w:b w:val="0"/>
+          <w:i w:val="0"/>
+          <w:sz w:val="21"/>
+        </w:rPr>
+        <w:t>edge_ai.models()</w:t>
+      </w:r>
+      <w:r>
+        <w:rPr>
+          <w:rFonts w:ascii="TH Sarabun New" w:hAnsi="TH Sarabun New" w:cs="TH Sarabun New" w:eastAsia="TH Sarabun New"/>
+          <w:b w:val="0"/>
+          <w:i w:val="0"/>
+        </w:rPr>
+        <w:t xml:space="preserve"> แล้วเก็บแค่ลำดับ ชื่อ และชื่อคลาส (ไม่พิมพ์ทั้งแถว) · เริ่มด้วย </w:t>
+      </w:r>
+      <w:r>
+        <w:rPr>
+          <w:rFonts w:ascii="Consolas" w:hAnsi="Consolas" w:cs="Consolas" w:eastAsia="Consolas"/>
+          <w:b w:val="0"/>
+          <w:i w:val="0"/>
+          <w:sz w:val="21"/>
+        </w:rPr>
+        <w:t>edge_ai.select(ลำดับ)</w:t>
+      </w:r>
+      <w:r>
+        <w:rPr>
+          <w:rFonts w:ascii="TH Sarabun New" w:hAnsi="TH Sarabun New" w:cs="TH Sarabun New" w:eastAsia="TH Sarabun New"/>
+          <w:b w:val="0"/>
+          <w:i w:val="0"/>
+        </w:rPr>
+        <w:t xml:space="preserve"> · อ่านคำตอบด้วย </w:t>
+      </w:r>
+      <w:r>
+        <w:rPr>
+          <w:rFonts w:ascii="Consolas" w:hAnsi="Consolas" w:cs="Consolas" w:eastAsia="Consolas"/>
+          <w:b w:val="0"/>
+          <w:i w:val="0"/>
+          <w:sz w:val="21"/>
+        </w:rPr>
+        <w:t>edge_ai.result()</w:t>
+      </w:r>
+      <w:r>
+        <w:rPr>
+          <w:rFonts w:ascii="TH Sarabun New" w:hAnsi="TH Sarabun New" w:cs="TH Sarabun New" w:eastAsia="TH Sarabun New"/>
+          <w:b w:val="0"/>
+          <w:i w:val="0"/>
+        </w:rPr>
+        <w:t xml:space="preserve"> · จบด้วย </w:t>
+      </w:r>
+      <w:r>
+        <w:rPr>
+          <w:rFonts w:ascii="Consolas" w:hAnsi="Consolas" w:cs="Consolas" w:eastAsia="Consolas"/>
+          <w:b w:val="0"/>
+          <w:i w:val="0"/>
+          <w:sz w:val="21"/>
+        </w:rPr>
+        <w:t>edge_ai.stop()</w:t>
+      </w:r>
+      <w:r>
+        <w:rPr>
+          <w:rFonts w:ascii="TH Sarabun New" w:hAnsi="TH Sarabun New" w:cs="TH Sarabun New" w:eastAsia="TH Sarabun New"/>
+          <w:b w:val="0"/>
+          <w:i w:val="0"/>
+        </w:rPr>
+        <w:t xml:space="preserve"> · ตัวกันเตือนผิด = </w:t>
+      </w:r>
+      <w:r>
+        <w:rPr>
+          <w:rFonts w:ascii="TH Sarabun New" w:hAnsi="TH Sarabun New" w:cs="TH Sarabun New" w:eastAsia="TH Sarabun New"/>
+          <w:b/>
+          <w:i w:val="0"/>
+        </w:rPr>
+        <w:t>ความมั่นใจขั้นต่ำ</w:t>
+      </w:r>
+      <w:r>
+        <w:rPr>
+          <w:rFonts w:ascii="TH Sarabun New" w:hAnsi="TH Sarabun New" w:cs="TH Sarabun New" w:eastAsia="TH Sarabun New"/>
+          <w:b w:val="0"/>
+          <w:i w:val="0"/>
+        </w:rPr>
+        <w:t xml:space="preserve"> </w:t>
+      </w:r>
+      <w:r>
+        <w:rPr>
+          <w:rFonts w:ascii="Consolas" w:hAnsi="Consolas" w:cs="Consolas" w:eastAsia="Consolas"/>
+          <w:b w:val="0"/>
+          <w:i w:val="0"/>
+          <w:sz w:val="21"/>
+        </w:rPr>
+        <w:t>CONF_MIN</w:t>
+      </w:r>
+      <w:r>
+        <w:rPr>
+          <w:rFonts w:ascii="TH Sarabun New" w:hAnsi="TH Sarabun New" w:cs="TH Sarabun New" w:eastAsia="TH Sarabun New"/>
+          <w:b w:val="0"/>
+          <w:i w:val="0"/>
+        </w:rPr>
+        <w:t xml:space="preserve"> + </w:t>
+      </w:r>
+      <w:r>
+        <w:rPr>
+          <w:rFonts w:ascii="TH Sarabun New" w:hAnsi="TH Sarabun New" w:cs="TH Sarabun New" w:eastAsia="TH Sarabun New"/>
+          <w:b/>
+          <w:i w:val="0"/>
+        </w:rPr>
+        <w:t>คลาสอันตรายต้องชนะติดกัน</w:t>
+      </w:r>
+      <w:r>
+        <w:rPr>
+          <w:rFonts w:ascii="TH Sarabun New" w:hAnsi="TH Sarabun New" w:cs="TH Sarabun New" w:eastAsia="TH Sarabun New"/>
+          <w:b w:val="0"/>
+          <w:i w:val="0"/>
+        </w:rPr>
+        <w:t xml:space="preserve"> </w:t>
+      </w:r>
+      <w:r>
+        <w:rPr>
+          <w:rFonts w:ascii="Consolas" w:hAnsi="Consolas" w:cs="Consolas" w:eastAsia="Consolas"/>
+          <w:b w:val="0"/>
+          <w:i w:val="0"/>
+          <w:sz w:val="21"/>
+        </w:rPr>
+        <w:t>CONFIRM_N</w:t>
+      </w:r>
+      <w:r>
+        <w:rPr>
+          <w:rFonts w:ascii="TH Sarabun New" w:hAnsi="TH Sarabun New" w:cs="TH Sarabun New" w:eastAsia="TH Sarabun New"/>
+          <w:b w:val="0"/>
+          <w:i w:val="0"/>
+        </w:rPr>
+        <w:t xml:space="preserve"> ครั้ง</w:t>
+      </w:r>
+    </w:p>
+    <w:p>
+      <w:pPr>
+        <w:pStyle w:val="ListBullet"/>
+        <w:spacing w:after="60"/>
+      </w:pPr>
+      <w:r>
+        <w:rPr>
+          <w:rFonts w:ascii="TH Sarabun New" w:hAnsi="TH Sarabun New" w:cs="TH Sarabun New" w:eastAsia="TH Sarabun New"/>
+          <w:b w:val="0"/>
+          <w:i w:val="0"/>
+        </w:rPr>
+        <w:t>[ ] รันไฟล์ แถวบนจอขึ้น "โมเดล: ____________________" (โมเดลที่ฟังไมค์จะมี "(ฟังไมค์)" ต่อท้าย) · ชื่อคลาสในการ์ด "คะแนนทุกคลาส (%)": ____________________</w:t>
+      </w:r>
+    </w:p>
+    <w:p>
+      <w:pPr>
+        <w:pStyle w:val="ListBullet"/>
+        <w:spacing w:after="60"/>
+      </w:pPr>
+      <w:r>
+        <w:rPr>
+          <w:rFonts w:ascii="TH Sarabun New" w:hAnsi="TH Sarabun New" w:cs="TH Sarabun New" w:eastAsia="TH Sarabun New"/>
+          <w:b w:val="0"/>
+          <w:i w:val="0"/>
+        </w:rPr>
+        <w:t>[ ] ☐ จอค้างที่ "โหลดโมเดลไม่สำเร็จ" → กด Stop ในเมนู Edge AI (ถ้ายังรันอยู่) หรือกด RESET แล้วรันใหม่</w:t>
+      </w:r>
+    </w:p>
+    <w:p>
+      <w:pPr>
+        <w:pStyle w:val="ListBullet"/>
+        <w:spacing w:after="60"/>
+      </w:pPr>
+      <w:r>
+        <w:rPr>
+          <w:rFonts w:ascii="TH Sarabun New" w:hAnsi="TH Sarabun New" w:cs="TH Sarabun New" w:eastAsia="TH Sarabun New"/>
+          <w:b w:val="0"/>
+          <w:i w:val="0"/>
+        </w:rPr>
+        <w:t>[ ] ☐ จอขึ้น "ไม่พบโมเดล AnomalousVibration / Motion บนบอร์ดนี้" → ข้ามคอลัมน์ AI ในตารางแข่ง (ขอดูบอร์ดของทีมข้าง ๆ ได้) แล้วทำ Code Quest ด้านล่างต่อ ไม่ต้องรอใคร</w:t>
       </w:r>
     </w:p>
     <w:p>
@@ -12046,6 +12669,140 @@
     </w:p>
     <w:p>
       <w:pPr>
+        <w:keepLines/>
+        <w:pBdr>
+          <w:left w:val="single" w:sz="18" w:space="8" w:color="2E5496"/>
+        </w:pBdr>
+        <w:shd w:val="clear" w:fill="F1F5FB"/>
+        <w:spacing w:before="120" w:after="160" w:line="274" w:lineRule="auto"/>
+        <w:ind w:left="283" w:right="113"/>
+      </w:pPr>
+      <w:r>
+        <w:rPr>
+          <w:rFonts w:ascii="TH Sarabun New" w:hAnsi="TH Sarabun New" w:cs="TH Sarabun New" w:eastAsia="TH Sarabun New"/>
+          <w:b w:val="0"/>
+          <w:i/>
+          <w:color w:val="5B616B"/>
+        </w:rPr>
+        <w:t>โจทย์ใช้ชื่อคลาสของ Motion (</w:t>
+      </w:r>
+      <w:r>
+        <w:rPr>
+          <w:rFonts w:ascii="Consolas" w:hAnsi="Consolas" w:cs="Consolas" w:eastAsia="Consolas"/>
+          <w:b w:val="0"/>
+          <w:i/>
+          <w:color w:val="5B616B"/>
+          <w:sz w:val="21"/>
+        </w:rPr>
+        <w:t>shaking</w:t>
+      </w:r>
+      <w:r>
+        <w:rPr>
+          <w:rFonts w:ascii="TH Sarabun New" w:hAnsi="TH Sarabun New" w:cs="TH Sarabun New" w:eastAsia="TH Sarabun New"/>
+          <w:b w:val="0"/>
+          <w:i/>
+          <w:color w:val="5B616B"/>
+        </w:rPr>
+        <w:t xml:space="preserve"> · </w:t>
+      </w:r>
+      <w:r>
+        <w:rPr>
+          <w:rFonts w:ascii="Consolas" w:hAnsi="Consolas" w:cs="Consolas" w:eastAsia="Consolas"/>
+          <w:b w:val="0"/>
+          <w:i/>
+          <w:color w:val="5B616B"/>
+          <w:sz w:val="21"/>
+        </w:rPr>
+        <w:t>idle</w:t>
+      </w:r>
+      <w:r>
+        <w:rPr>
+          <w:rFonts w:ascii="TH Sarabun New" w:hAnsi="TH Sarabun New" w:cs="TH Sarabun New" w:eastAsia="TH Sarabun New"/>
+          <w:b w:val="0"/>
+          <w:i/>
+          <w:color w:val="5B616B"/>
+        </w:rPr>
+        <w:t xml:space="preserve">) · บอร์ดที่ใช้ AnomalousVibration ให้อ่าน </w:t>
+      </w:r>
+      <w:r>
+        <w:rPr>
+          <w:rFonts w:ascii="Consolas" w:hAnsi="Consolas" w:cs="Consolas" w:eastAsia="Consolas"/>
+          <w:b w:val="0"/>
+          <w:i/>
+          <w:color w:val="5B616B"/>
+          <w:sz w:val="21"/>
+        </w:rPr>
+        <w:t>shaking</w:t>
+      </w:r>
+      <w:r>
+        <w:rPr>
+          <w:rFonts w:ascii="TH Sarabun New" w:hAnsi="TH Sarabun New" w:cs="TH Sarabun New" w:eastAsia="TH Sarabun New"/>
+          <w:b w:val="0"/>
+          <w:i/>
+          <w:color w:val="5B616B"/>
+        </w:rPr>
+        <w:t xml:space="preserve"> เป็น </w:t>
+      </w:r>
+      <w:r>
+        <w:rPr>
+          <w:rFonts w:ascii="Consolas" w:hAnsi="Consolas" w:cs="Consolas" w:eastAsia="Consolas"/>
+          <w:b w:val="0"/>
+          <w:i/>
+          <w:color w:val="5B616B"/>
+          <w:sz w:val="21"/>
+        </w:rPr>
+        <w:t>anomaly</w:t>
+      </w:r>
+      <w:r>
+        <w:rPr>
+          <w:rFonts w:ascii="TH Sarabun New" w:hAnsi="TH Sarabun New" w:cs="TH Sarabun New" w:eastAsia="TH Sarabun New"/>
+          <w:b w:val="0"/>
+          <w:i/>
+          <w:color w:val="5B616B"/>
+        </w:rPr>
+        <w:t xml:space="preserve"> และ </w:t>
+      </w:r>
+      <w:r>
+        <w:rPr>
+          <w:rFonts w:ascii="Consolas" w:hAnsi="Consolas" w:cs="Consolas" w:eastAsia="Consolas"/>
+          <w:b w:val="0"/>
+          <w:i/>
+          <w:color w:val="5B616B"/>
+          <w:sz w:val="21"/>
+        </w:rPr>
+        <w:t>idle</w:t>
+      </w:r>
+      <w:r>
+        <w:rPr>
+          <w:rFonts w:ascii="TH Sarabun New" w:hAnsi="TH Sarabun New" w:cs="TH Sarabun New" w:eastAsia="TH Sarabun New"/>
+          <w:b w:val="0"/>
+          <w:i/>
+          <w:color w:val="5B616B"/>
+        </w:rPr>
+        <w:t xml:space="preserve"> เป็น </w:t>
+      </w:r>
+      <w:r>
+        <w:rPr>
+          <w:rFonts w:ascii="Consolas" w:hAnsi="Consolas" w:cs="Consolas" w:eastAsia="Consolas"/>
+          <w:b w:val="0"/>
+          <w:i/>
+          <w:color w:val="5B616B"/>
+          <w:sz w:val="21"/>
+        </w:rPr>
+        <w:t>unlabeled</w:t>
+      </w:r>
+      <w:r>
+        <w:rPr>
+          <w:rFonts w:ascii="TH Sarabun New" w:hAnsi="TH Sarabun New" w:cs="TH Sarabun New" w:eastAsia="TH Sarabun New"/>
+          <w:b w:val="0"/>
+          <w:i/>
+          <w:color w:val="5B616B"/>
+        </w:rPr>
+        <w:t xml:space="preserve"> — กฎและเฉลยเหมือนกันทุกข้อ</w:t>
+      </w:r>
+    </w:p>
+    <w:p>
+      <w:pPr>
         <w:pStyle w:val="ListBullet"/>
         <w:spacing w:after="60"/>
       </w:pPr>
@@ -12980,6 +13737,385 @@
     </w:p>
     <w:p>
       <w:pPr>
+        <w:pStyle w:val="Heading3"/>
+      </w:pPr>
+      <w:r>
+        <w:rPr>
+          <w:rFonts w:ascii="TH Sarabun New" w:hAnsi="TH Sarabun New" w:cs="TH Sarabun New" w:eastAsia="TH Sarabun New"/>
+          <w:b/>
+          <w:i w:val="0"/>
+          <w:color w:val="2E5496"/>
+        </w:rPr>
+        <w:t>6.4 ต่อยอด (ถ้ามีเวลา / การบ้าน) — ส่งผล AI ขึ้น MQTT (</w:t>
+      </w:r>
+      <w:r>
+        <w:rPr>
+          <w:rFonts w:ascii="TH Sarabun New" w:hAnsi="TH Sarabun New" w:cs="TH Sarabun New" w:eastAsia="TH Sarabun New"/>
+          <w:b/>
+          <w:i w:val="0"/>
+          <w:color w:val="2E5496"/>
+          <w:sz w:val="21"/>
+        </w:rPr>
+        <w:t>sf3_06_ai_to_mqtt.py</w:t>
+      </w:r>
+      <w:r>
+        <w:rPr>
+          <w:rFonts w:ascii="TH Sarabun New" w:hAnsi="TH Sarabun New" w:cs="TH Sarabun New" w:eastAsia="TH Sarabun New"/>
+          <w:b/>
+          <w:i w:val="0"/>
+          <w:color w:val="2E5496"/>
+        </w:rPr>
+        <w:t>)</w:t>
+      </w:r>
+    </w:p>
+    <w:p>
+      <w:r>
+        <w:rPr>
+          <w:rFonts w:ascii="TH Sarabun New" w:hAnsi="TH Sarabun New" w:cs="TH Sarabun New" w:eastAsia="TH Sarabun New"/>
+          <w:b w:val="0"/>
+          <w:i w:val="0"/>
+        </w:rPr>
+        <w:t xml:space="preserve">ไฟล์นี้ส่ง </w:t>
+      </w:r>
+      <w:r>
+        <w:rPr>
+          <w:rFonts w:ascii="TH Sarabun New" w:hAnsi="TH Sarabun New" w:cs="TH Sarabun New" w:eastAsia="TH Sarabun New"/>
+          <w:b/>
+          <w:i w:val="0"/>
+        </w:rPr>
+        <w:t>ผลสรุป</w:t>
+      </w:r>
+      <w:r>
+        <w:rPr>
+          <w:rFonts w:ascii="TH Sarabun New" w:hAnsi="TH Sarabun New" w:cs="TH Sarabun New" w:eastAsia="TH Sarabun New"/>
+          <w:b w:val="0"/>
+          <w:i w:val="0"/>
+        </w:rPr>
+        <w:t xml:space="preserve"> ของ AI (ไม่ใช่ข้อมูลดิบ) ขึ้นหัวข้อ </w:t>
+      </w:r>
+      <w:r>
+        <w:rPr>
+          <w:rFonts w:ascii="Consolas" w:hAnsi="Consolas" w:cs="Consolas" w:eastAsia="Consolas"/>
+          <w:b w:val="0"/>
+          <w:i w:val="0"/>
+          <w:sz w:val="21"/>
+        </w:rPr>
+        <w:t>bento-aiot/&lt;TEAM&gt;/ai</w:t>
+      </w:r>
+      <w:r>
+        <w:rPr>
+          <w:rFonts w:ascii="TH Sarabun New" w:hAnsi="TH Sarabun New" w:cs="TH Sarabun New" w:eastAsia="TH Sarabun New"/>
+          <w:b w:val="0"/>
+          <w:i w:val="0"/>
+        </w:rPr>
+        <w:t xml:space="preserve"> เมื่อป้ายเปลี่ยน และส่งซ้ำทุก 2 วินาทีเป็นสัญญาณชีพ (heartbeat) · ข้อความหนึ่งใบมี </w:t>
+      </w:r>
+      <w:r>
+        <w:rPr>
+          <w:rFonts w:ascii="Consolas" w:hAnsi="Consolas" w:cs="Consolas" w:eastAsia="Consolas"/>
+          <w:b w:val="0"/>
+          <w:i w:val="0"/>
+          <w:sz w:val="21"/>
+        </w:rPr>
+        <w:t>id</w:t>
+      </w:r>
+      <w:r>
+        <w:rPr>
+          <w:rFonts w:ascii="TH Sarabun New" w:hAnsi="TH Sarabun New" w:cs="TH Sarabun New" w:eastAsia="TH Sarabun New"/>
+          <w:b w:val="0"/>
+          <w:i w:val="0"/>
+        </w:rPr>
+        <w:t xml:space="preserve"> </w:t>
+      </w:r>
+      <w:r>
+        <w:rPr>
+          <w:rFonts w:ascii="Consolas" w:hAnsi="Consolas" w:cs="Consolas" w:eastAsia="Consolas"/>
+          <w:b w:val="0"/>
+          <w:i w:val="0"/>
+          <w:sz w:val="21"/>
+        </w:rPr>
+        <w:t>n</w:t>
+      </w:r>
+      <w:r>
+        <w:rPr>
+          <w:rFonts w:ascii="TH Sarabun New" w:hAnsi="TH Sarabun New" w:cs="TH Sarabun New" w:eastAsia="TH Sarabun New"/>
+          <w:b w:val="0"/>
+          <w:i w:val="0"/>
+        </w:rPr>
+        <w:t xml:space="preserve"> </w:t>
+      </w:r>
+      <w:r>
+        <w:rPr>
+          <w:rFonts w:ascii="Consolas" w:hAnsi="Consolas" w:cs="Consolas" w:eastAsia="Consolas"/>
+          <w:b w:val="0"/>
+          <w:i w:val="0"/>
+          <w:sz w:val="21"/>
+        </w:rPr>
+        <w:t>model</w:t>
+      </w:r>
+      <w:r>
+        <w:rPr>
+          <w:rFonts w:ascii="TH Sarabun New" w:hAnsi="TH Sarabun New" w:cs="TH Sarabun New" w:eastAsia="TH Sarabun New"/>
+          <w:b w:val="0"/>
+          <w:i w:val="0"/>
+        </w:rPr>
+        <w:t xml:space="preserve"> </w:t>
+      </w:r>
+      <w:r>
+        <w:rPr>
+          <w:rFonts w:ascii="Consolas" w:hAnsi="Consolas" w:cs="Consolas" w:eastAsia="Consolas"/>
+          <w:b w:val="0"/>
+          <w:i w:val="0"/>
+          <w:sz w:val="21"/>
+        </w:rPr>
+        <w:t>label</w:t>
+      </w:r>
+      <w:r>
+        <w:rPr>
+          <w:rFonts w:ascii="TH Sarabun New" w:hAnsi="TH Sarabun New" w:cs="TH Sarabun New" w:eastAsia="TH Sarabun New"/>
+          <w:b w:val="0"/>
+          <w:i w:val="0"/>
+        </w:rPr>
+        <w:t xml:space="preserve"> </w:t>
+      </w:r>
+      <w:r>
+        <w:rPr>
+          <w:rFonts w:ascii="Consolas" w:hAnsi="Consolas" w:cs="Consolas" w:eastAsia="Consolas"/>
+          <w:b w:val="0"/>
+          <w:i w:val="0"/>
+          <w:sz w:val="21"/>
+        </w:rPr>
+        <w:t>conf</w:t>
+      </w:r>
+      <w:r>
+        <w:rPr>
+          <w:rFonts w:ascii="TH Sarabun New" w:hAnsi="TH Sarabun New" w:cs="TH Sarabun New" w:eastAsia="TH Sarabun New"/>
+          <w:b w:val="0"/>
+          <w:i w:val="0"/>
+        </w:rPr>
+        <w:t xml:space="preserve"> (%)</w:t>
+      </w:r>
+    </w:p>
+    <w:p>
+      <w:pPr>
+        <w:pStyle w:val="ListBullet"/>
+        <w:spacing w:after="60"/>
+      </w:pPr>
+      <w:r>
+        <w:rPr>
+          <w:rFonts w:ascii="TH Sarabun New" w:hAnsi="TH Sarabun New" w:cs="TH Sarabun New" w:eastAsia="TH Sarabun New"/>
+          <w:b w:val="0"/>
+          <w:i w:val="0"/>
+        </w:rPr>
+        <w:t xml:space="preserve">[ ] แก้ </w:t>
+      </w:r>
+      <w:r>
+        <w:rPr>
+          <w:rFonts w:ascii="Consolas" w:hAnsi="Consolas" w:cs="Consolas" w:eastAsia="Consolas"/>
+          <w:b w:val="0"/>
+          <w:i w:val="0"/>
+          <w:sz w:val="21"/>
+        </w:rPr>
+        <w:t>WIFI_SSID</w:t>
+      </w:r>
+      <w:r>
+        <w:rPr>
+          <w:rFonts w:ascii="TH Sarabun New" w:hAnsi="TH Sarabun New" w:cs="TH Sarabun New" w:eastAsia="TH Sarabun New"/>
+          <w:b w:val="0"/>
+          <w:i w:val="0"/>
+        </w:rPr>
+        <w:t xml:space="preserve"> </w:t>
+      </w:r>
+      <w:r>
+        <w:rPr>
+          <w:rFonts w:ascii="Consolas" w:hAnsi="Consolas" w:cs="Consolas" w:eastAsia="Consolas"/>
+          <w:b w:val="0"/>
+          <w:i w:val="0"/>
+          <w:sz w:val="21"/>
+        </w:rPr>
+        <w:t>WIFI_PASS</w:t>
+      </w:r>
+      <w:r>
+        <w:rPr>
+          <w:rFonts w:ascii="TH Sarabun New" w:hAnsi="TH Sarabun New" w:cs="TH Sarabun New" w:eastAsia="TH Sarabun New"/>
+          <w:b w:val="0"/>
+          <w:i w:val="0"/>
+        </w:rPr>
+        <w:t xml:space="preserve"> </w:t>
+      </w:r>
+      <w:r>
+        <w:rPr>
+          <w:rFonts w:ascii="Consolas" w:hAnsi="Consolas" w:cs="Consolas" w:eastAsia="Consolas"/>
+          <w:b w:val="0"/>
+          <w:i w:val="0"/>
+          <w:sz w:val="21"/>
+        </w:rPr>
+        <w:t>TEAM</w:t>
+      </w:r>
+      <w:r>
+        <w:rPr>
+          <w:rFonts w:ascii="TH Sarabun New" w:hAnsi="TH Sarabun New" w:cs="TH Sarabun New" w:eastAsia="TH Sarabun New"/>
+          <w:b w:val="0"/>
+          <w:i w:val="0"/>
+        </w:rPr>
+        <w:t xml:space="preserve"> (team01–team99 · ยังเป็น teamXX = ไม่ต่อเน็ต พิมพ์ผลลง Console แทน) แล้วรัน</w:t>
+      </w:r>
+    </w:p>
+    <w:p>
+      <w:pPr>
+        <w:pStyle w:val="ListBullet"/>
+        <w:spacing w:after="60"/>
+      </w:pPr>
+      <w:r>
+        <w:rPr>
+          <w:rFonts w:ascii="TH Sarabun New" w:hAnsi="TH Sarabun New" w:cs="TH Sarabun New" w:eastAsia="TH Sarabun New"/>
+          <w:b w:val="0"/>
+          <w:i w:val="0"/>
+        </w:rPr>
+        <w:t xml:space="preserve">[ ] เปิดแดชบอร์ดของคอร์ส &lt;https://advance-innovation-centre-aic.github.io/aiot-development-for-smart-farm/apps/web-dashboard/&gt; ใส่ TEAM เดียวกัน หรือพิมพ์บนโน้ตบุ๊ก </w:t>
+      </w:r>
+      <w:r>
+        <w:rPr>
+          <w:rFonts w:ascii="Consolas" w:hAnsi="Consolas" w:cs="Consolas" w:eastAsia="Consolas"/>
+          <w:b w:val="0"/>
+          <w:i w:val="0"/>
+          <w:sz w:val="21"/>
+        </w:rPr>
+        <w:t>mosquitto_sub -h broker.hivemq.com -t 'bento-aiot/team__/ai' -v</w:t>
+      </w:r>
+    </w:p>
+    <w:p>
+      <w:pPr>
+        <w:pStyle w:val="ListBullet"/>
+        <w:spacing w:after="60"/>
+      </w:pPr>
+      <w:r>
+        <w:rPr>
+          <w:rFonts w:ascii="TH Sarabun New" w:hAnsi="TH Sarabun New" w:cs="TH Sarabun New" w:eastAsia="TH Sarabun New"/>
+          <w:b w:val="0"/>
+          <w:i w:val="0"/>
+        </w:rPr>
+        <w:t xml:space="preserve">[ ] </w:t>
+      </w:r>
+      <w:r>
+        <w:rPr>
+          <w:rFonts w:ascii="TH Sarabun New" w:hAnsi="TH Sarabun New" w:cs="TH Sarabun New" w:eastAsia="TH Sarabun New"/>
+          <w:b/>
+          <w:i w:val="0"/>
+        </w:rPr>
+        <w:t>เดาก่อนรัน:</w:t>
+      </w:r>
+      <w:r>
+        <w:rPr>
+          <w:rFonts w:ascii="TH Sarabun New" w:hAnsi="TH Sarabun New" w:cs="TH Sarabun New" w:eastAsia="TH Sarabun New"/>
+          <w:b w:val="0"/>
+          <w:i w:val="0"/>
+        </w:rPr>
+        <w:t xml:space="preserve"> วางบอร์ดนิ่ง 10 วินาที จะได้ข้อความประมาณ ______ ใบ · รันจริงได้ ______ ใบ ☐ ตรง ☐ ไม่ตรง</w:t>
+      </w:r>
+    </w:p>
+    <w:p>
+      <w:pPr>
+        <w:pStyle w:val="ListBullet"/>
+        <w:spacing w:after="60"/>
+      </w:pPr>
+      <w:r>
+        <w:rPr>
+          <w:rFonts w:ascii="TH Sarabun New" w:hAnsi="TH Sarabun New" w:cs="TH Sarabun New" w:eastAsia="TH Sarabun New"/>
+          <w:b w:val="0"/>
+          <w:i w:val="0"/>
+        </w:rPr>
+        <w:t>[ ] เขย่า: ป้ายใหม่มาถึงแอปภายใน ☐ ไม่ถึง 1 วินาที ☐ ราว 2 วินาที ☐ นานกว่านั้น</w:t>
+      </w:r>
+    </w:p>
+    <w:p>
+      <w:pPr>
+        <w:pStyle w:val="ListBullet"/>
+        <w:spacing w:after="60"/>
+      </w:pPr>
+      <w:r>
+        <w:rPr>
+          <w:rFonts w:ascii="TH Sarabun New" w:hAnsi="TH Sarabun New" w:cs="TH Sarabun New" w:eastAsia="TH Sarabun New"/>
+          <w:b w:val="0"/>
+          <w:i w:val="0"/>
+        </w:rPr>
+        <w:t xml:space="preserve">[ ] </w:t>
+      </w:r>
+      <w:r>
+        <w:rPr>
+          <w:rFonts w:ascii="TH Sarabun New" w:hAnsi="TH Sarabun New" w:cs="TH Sarabun New" w:eastAsia="TH Sarabun New"/>
+          <w:b/>
+          <w:i w:val="0"/>
+        </w:rPr>
+        <w:t>แก้:</w:t>
+      </w:r>
+      <w:r>
+        <w:rPr>
+          <w:rFonts w:ascii="TH Sarabun New" w:hAnsi="TH Sarabun New" w:cs="TH Sarabun New" w:eastAsia="TH Sarabun New"/>
+          <w:b w:val="0"/>
+          <w:i w:val="0"/>
+        </w:rPr>
+        <w:t xml:space="preserve"> ตั้ง </w:t>
+      </w:r>
+      <w:r>
+        <w:rPr>
+          <w:rFonts w:ascii="Consolas" w:hAnsi="Consolas" w:cs="Consolas" w:eastAsia="Consolas"/>
+          <w:b w:val="0"/>
+          <w:i w:val="0"/>
+          <w:sz w:val="21"/>
+        </w:rPr>
+        <w:t>HEARTBEAT_MS = 10000</w:t>
+      </w:r>
+      <w:r>
+        <w:rPr>
+          <w:rFonts w:ascii="TH Sarabun New" w:hAnsi="TH Sarabun New" w:cs="TH Sarabun New" w:eastAsia="TH Sarabun New"/>
+          <w:b w:val="0"/>
+          <w:i w:val="0"/>
+        </w:rPr>
+        <w:t xml:space="preserve"> วางนิ่ง 10 วินาทีได้ ______ ใบ · ข้อดีและข้อเสียของ heartbeat ที่ห่างขึ้น: ____________________</w:t>
+      </w:r>
+    </w:p>
+    <w:p>
+      <w:pPr>
+        <w:keepLines/>
+        <w:pBdr>
+          <w:left w:val="single" w:sz="18" w:space="8" w:color="2E5496"/>
+        </w:pBdr>
+        <w:shd w:val="clear" w:fill="F1F5FB"/>
+        <w:spacing w:before="120" w:after="160" w:line="274" w:lineRule="auto"/>
+        <w:ind w:left="283" w:right="113"/>
+      </w:pPr>
+      <w:r>
+        <w:rPr>
+          <w:rFonts w:ascii="TH Sarabun New" w:hAnsi="TH Sarabun New" w:cs="TH Sarabun New" w:eastAsia="TH Sarabun New"/>
+          <w:b w:val="0"/>
+          <w:i/>
+          <w:color w:val="5B616B"/>
+        </w:rPr>
+        <w:t xml:space="preserve">เฉลยข้อเดา: 4–5 ใบถ้าป้ายนิ่ง (heartbeat ทุกราว 2 วินาที) · ได้มากกว่านี้มาก = ป้ายกระพริบไปมา ดูค่า </w:t>
+      </w:r>
+      <w:r>
+        <w:rPr>
+          <w:rFonts w:ascii="Consolas" w:hAnsi="Consolas" w:cs="Consolas" w:eastAsia="Consolas"/>
+          <w:b w:val="0"/>
+          <w:i/>
+          <w:color w:val="5B616B"/>
+          <w:sz w:val="21"/>
+        </w:rPr>
+        <w:t>label</w:t>
+      </w:r>
+      <w:r>
+        <w:rPr>
+          <w:rFonts w:ascii="TH Sarabun New" w:hAnsi="TH Sarabun New" w:cs="TH Sarabun New" w:eastAsia="TH Sarabun New"/>
+          <w:b w:val="0"/>
+          <w:i/>
+          <w:color w:val="5B616B"/>
+        </w:rPr>
+        <w:t xml:space="preserve"> ในข้อความ · ตั้ง 10000 เหลือราว 1 ใบ: ประหยัดเน็ต แต่แอปรู้ช้าลงว่าบอร์ดหายไป (ลองเสร็จตั้งกลับเป็น 2000)</w:t>
+      </w:r>
+    </w:p>
+    <w:p>
+      <w:pPr>
         <w:pBdr>
           <w:bottom w:val="single" w:sz="6" w:space="1" w:color="9DB2D4"/>
         </w:pBdr>
@@ -13382,7 +14518,57 @@
           <w:b w:val="0"/>
           <w:i w:val="0"/>
         </w:rPr>
-        <w:t xml:space="preserve"> แล้วไฟปั๊มติดราว 10 วินาที และแถบล่างขึ้น "แอป: pump 10 วิ" ☐ · ส่ง </w:t>
+        <w:t xml:space="preserve"> แล้วไฟปั๊มติดราว 10 วินาที และแถบล่างขึ้น "แอป: pump 10 วิ" ☐ · หมุน VR2 ให้ดินแห้งจนไฟปั๊มติด แล้วกดปุ่ม </w:t>
+      </w:r>
+      <w:r>
+        <w:rPr>
+          <w:rFonts w:ascii="TH Sarabun New" w:hAnsi="TH Sarabun New" w:cs="TH Sarabun New" w:eastAsia="TH Sarabun New"/>
+          <w:b/>
+          <w:i w:val="0"/>
+        </w:rPr>
+        <w:t>ปิดปั๊ม</w:t>
+      </w:r>
+      <w:r>
+        <w:rPr>
+          <w:rFonts w:ascii="TH Sarabun New" w:hAnsi="TH Sarabun New" w:cs="TH Sarabun New" w:eastAsia="TH Sarabun New"/>
+          <w:b w:val="0"/>
+          <w:i w:val="0"/>
+        </w:rPr>
+        <w:t xml:space="preserve"> ใน </w:t>
+      </w:r>
+      <w:r>
+        <w:rPr>
+          <w:rFonts w:ascii="Consolas" w:hAnsi="Consolas" w:cs="Consolas" w:eastAsia="Consolas"/>
+          <w:b w:val="0"/>
+          <w:i w:val="0"/>
+          <w:sz w:val="21"/>
+        </w:rPr>
+        <w:t>farm_web.html</w:t>
+      </w:r>
+      <w:r>
+        <w:rPr>
+          <w:rFonts w:ascii="TH Sarabun New" w:hAnsi="TH Sarabun New" w:cs="TH Sarabun New" w:eastAsia="TH Sarabun New"/>
+          <w:b w:val="0"/>
+          <w:i w:val="0"/>
+        </w:rPr>
+        <w:t xml:space="preserve"> (ปิด </w:t>
+      </w:r>
+      <w:r>
+        <w:rPr>
+          <w:rFonts w:ascii="Consolas" w:hAnsi="Consolas" w:cs="Consolas" w:eastAsia="Consolas"/>
+          <w:b w:val="0"/>
+          <w:i w:val="0"/>
+          <w:sz w:val="21"/>
+        </w:rPr>
+        <w:t>farm_monitor.py</w:t>
+      </w:r>
+      <w:r>
+        <w:rPr>
+          <w:rFonts w:ascii="TH Sarabun New" w:hAnsi="TH Sarabun New" w:cs="TH Sarabun New" w:eastAsia="TH Sarabun New"/>
+          <w:b w:val="0"/>
+          <w:i w:val="0"/>
+        </w:rPr>
+        <w:t xml:space="preserve"> ก่อน เพราะกฎของมันสั่งรดน้ำเองตอนดินแห้ง) ไฟปั๊มดับทันที แถบล่างขึ้น "แอป: pump 0 วิ" และไม่ติดเองอีกราว 30 วินาที ☐ · ส่ง </w:t>
       </w:r>
       <w:r>
         <w:rPr>

</xml_diff>

<commit_message>
session3: store steps use the names on the live page; sf3_06 shows an MQTT status light
- Slides and worksheet: open edgeai-store.tesaiot.dev (Edge AI model catalog),
  press Connect a board and pick the board's port, press Deploy on the model.
  These are the labels the live page shows; the deploy dialog text is unchanged.
- sf3_04, sf3_06: comments name the store the same way. sf3_04's compiled
  bytecode is unchanged.
- sf3_06: an MQTT Led with a status label (connected / offline) that updates on
  connect and when the link drops. Imported 3/3 on a Dev Kit running 2.4.2; the
  pushed file compiles to the same bytecode as the tested one.
</commit_message>
<xml_diff>
--- a/s3/sf-s3-th.docx
+++ b/s3/sf-s3-th.docx
@@ -10844,7 +10844,7 @@
           <w:b w:val="0"/>
           <w:i w:val="0"/>
         </w:rPr>
-        <w:t xml:space="preserve"> แล้วเปิดหน้า </w:t>
+        <w:t xml:space="preserve"> (หน้า </w:t>
       </w:r>
       <w:r>
         <w:rPr>
@@ -10852,15 +10852,15 @@
           <w:b/>
           <w:i w:val="0"/>
         </w:rPr>
-        <w:t>Playground</w:t>
-      </w:r>
-      <w:r>
-        <w:rPr>
-          <w:rFonts w:ascii="TH Sarabun New" w:hAnsi="TH Sarabun New" w:cs="TH Sarabun New" w:eastAsia="TH Sarabun New"/>
-          <w:b w:val="0"/>
-          <w:i w:val="0"/>
-        </w:rPr>
-        <w:t xml:space="preserve"> (ไม่ใช่ </w:t>
+        <w:t>Edge AI model catalog</w:t>
+      </w:r>
+      <w:r>
+        <w:rPr>
+          <w:rFonts w:ascii="TH Sarabun New" w:hAnsi="TH Sarabun New" w:cs="TH Sarabun New" w:eastAsia="TH Sarabun New"/>
+          <w:b w:val="0"/>
+          <w:i w:val="0"/>
+        </w:rPr>
+        <w:t xml:space="preserve"> · ไม่ใช่ </w:t>
       </w:r>
       <w:r>
         <w:rPr>
@@ -10877,7 +10877,23 @@
           <w:b w:val="0"/>
           <w:i w:val="0"/>
         </w:rPr>
-        <w:t xml:space="preserve"> ซึ่งเป็นคนละระบบ)</w:t>
+        <w:t xml:space="preserve"> ซึ่งเป็นคนละระบบ) แล้วกด </w:t>
+      </w:r>
+      <w:r>
+        <w:rPr>
+          <w:rFonts w:ascii="TH Sarabun New" w:hAnsi="TH Sarabun New" w:cs="TH Sarabun New" w:eastAsia="TH Sarabun New"/>
+          <w:b/>
+          <w:i w:val="0"/>
+        </w:rPr>
+        <w:t>Connect a board</w:t>
+      </w:r>
+      <w:r>
+        <w:rPr>
+          <w:rFonts w:ascii="TH Sarabun New" w:hAnsi="TH Sarabun New" w:cs="TH Sarabun New" w:eastAsia="TH Sarabun New"/>
+          <w:b w:val="0"/>
+          <w:i w:val="0"/>
+        </w:rPr>
+        <w:t xml:space="preserve"> เลือกพอร์ตของบอร์ด</w:t>
       </w:r>
     </w:p>
     <w:p>
@@ -10891,7 +10907,7 @@
           <w:b w:val="0"/>
           <w:i w:val="0"/>
         </w:rPr>
-        <w:t>[ ] กดติดตั้ง (</w:t>
+        <w:t xml:space="preserve">[ ] กด </w:t>
       </w:r>
       <w:r>
         <w:rPr>
@@ -10907,7 +10923,7 @@
           <w:b w:val="0"/>
           <w:i w:val="0"/>
         </w:rPr>
-        <w:t xml:space="preserve">) ที่โมเดล </w:t>
+        <w:t xml:space="preserve"> ที่โมเดล </w:t>
       </w:r>
       <w:r>
         <w:rPr>
@@ -10957,7 +10973,7 @@
           <w:b w:val="0"/>
           <w:i w:val="0"/>
         </w:rPr>
-        <w:t>) · ถ้า Chrome ถามพอร์ต เลือกพอร์ตของบอร์ด · ห้ามถอดสาย USB ระหว่างส่ง</w:t>
+        <w:t>) · ห้ามถอดสาย USB ระหว่างส่ง</w:t>
       </w:r>
     </w:p>
     <w:p>

</xml_diff>

<commit_message>
session3: point the Edge AI activity at the AI Model Lab (sf3_07) for trying any model
</commit_message>
<xml_diff>
--- a/s3/sf-s3-th.docx
+++ b/s3/sf-s3-th.docx
@@ -11343,6 +11343,37 @@
           <w:i w:val="0"/>
         </w:rPr>
         <w:t xml:space="preserve"> สีแดง ☐ (ออกจากหน้านี้เฉย ๆ โมเดลยังรันต่อ)</w:t>
+      </w:r>
+    </w:p>
+    <w:p>
+      <w:pPr>
+        <w:pStyle w:val="ListBullet"/>
+        <w:spacing w:after="60"/>
+      </w:pPr>
+      <w:r>
+        <w:rPr>
+          <w:rFonts w:ascii="TH Sarabun New" w:hAnsi="TH Sarabun New" w:cs="TH Sarabun New" w:eastAsia="TH Sarabun New"/>
+          <w:b w:val="0"/>
+          <w:i w:val="0"/>
+        </w:rPr>
+        <w:t xml:space="preserve">[ ] (ลองโมเดลอื่นเร็ว ๆ) รัน </w:t>
+      </w:r>
+      <w:r>
+        <w:rPr>
+          <w:rFonts w:ascii="Consolas" w:hAnsi="Consolas" w:cs="Consolas" w:eastAsia="Consolas"/>
+          <w:b w:val="0"/>
+          <w:i w:val="0"/>
+          <w:sz w:val="21"/>
+        </w:rPr>
+        <w:t>s3/sf3_07_ai_model_lab.py</w:t>
+      </w:r>
+      <w:r>
+        <w:rPr>
+          <w:rFonts w:ascii="TH Sarabun New" w:hAnsi="TH Sarabun New" w:cs="TH Sarabun New" w:eastAsia="TH Sarabun New"/>
+          <w:b w:val="0"/>
+          <w:i w:val="0"/>
+        </w:rPr>
+        <w:t xml:space="preserve"> ห้องทดลองโมเดล AI: เลื่อนเลือกโมเดล → กด Run/Stop → ดูผลสด ปรับเกณฑ์ Hearing at / Confirm at ได้บนจอเดียว · โมเดลที่ใช้ลอง: ________</w:t>
       </w:r>
     </w:p>
     <w:p>

</xml_diff>

<commit_message>
feat(project): starter kits for the eight ideas, a kickoff deck, and the one-week brief
project/: one MicroPython HMI file per idea (MQTT events or telemetry and a command back, built from sf2_03, sf2_04 or sf3_01) and a single idea_web.html whose IDEAS block configures labels, charts, commands and rules per idea. All eight files run in the BENTO Emulator without a traceback and pass the board-font glyph gate and mpy-cross.

slides/sf-project-kickoff: rules, the eight kits with board and phone screenshots, the three required extensions, the two-person split, the fallback, the calendar and the rubric.

PROJECT_BRIEF_lite_th: Edge AI is no longer part of the project; teams take one idea's kit, keep a distinct user or place, and extend at least three things (30 of 100 points).
</commit_message>
<xml_diff>
--- a/s3/sf-s3-th.docx
+++ b/s3/sf-s3-th.docx
@@ -489,7 +489,7 @@
         </w:rPr>
         <w:t xml:space="preserve">ไฟล์คาบ 3: </w:t>
       </w:r>
-      <w:hyperlink w:history="1" r:id="rIdvqmi7zzwapbxlg2cuxjuy">
+      <w:hyperlink w:history="1" r:id="rIdydcpi3rb6p4zj0i7tis9a">
         <w:r>
           <w:rPr>
             <w:rFonts w:ascii="TH Sarabun New" w:cs="TH Sarabun New" w:eastAsia="TH Sarabun New" w:hAnsi="TH Sarabun New"/>
@@ -2003,7 +2003,7 @@
         </w:rPr>
         <w:t xml:space="preserve">ไฟล์: </w:t>
       </w:r>
-      <w:hyperlink w:history="1" r:id="rId7qsljwltw_6w93nd4eotl">
+      <w:hyperlink w:history="1" r:id="rIdm86gaigiliyqsxuy03jpq">
         <w:r>
           <w:rPr>
             <w:rFonts w:ascii="TH Sarabun New" w:cs="TH Sarabun New" w:eastAsia="TH Sarabun New" w:hAnsi="TH Sarabun New"/>
@@ -2592,7 +2592,7 @@
         </w:rPr>
         <w:t xml:space="preserve">ไฟล์: </w:t>
       </w:r>
-      <w:hyperlink w:history="1" r:id="rId8dfraoq2latoeunraoanq">
+      <w:hyperlink w:history="1" r:id="rIdkgd_s2ofnx0ldidhcybp-">
         <w:r>
           <w:rPr>
             <w:rFonts w:ascii="TH Sarabun New" w:cs="TH Sarabun New" w:eastAsia="TH Sarabun New" w:hAnsi="TH Sarabun New"/>
@@ -3054,7 +3054,7 @@
         </w:rPr>
         <w:t xml:space="preserve">ไฟล์: </w:t>
       </w:r>
-      <w:hyperlink w:history="1" r:id="rIdc7ihhepidk_pf3c1ugihq">
+      <w:hyperlink w:history="1" r:id="rIdbiylswvip8a_d4czboudi">
         <w:r>
           <w:rPr>
             <w:rFonts w:ascii="TH Sarabun New" w:cs="TH Sarabun New" w:eastAsia="TH Sarabun New" w:hAnsi="TH Sarabun New"/>
@@ -3736,7 +3736,7 @@
         </w:rPr>
         <w:t xml:space="preserve">ไฟล์: </w:t>
       </w:r>
-      <w:hyperlink w:history="1" r:id="rIduw2mvs6l7slswbuimw5gy">
+      <w:hyperlink w:history="1" r:id="rIdgsctn80vivka2kdhhx2jf">
         <w:r>
           <w:rPr>
             <w:rFonts w:ascii="TH Sarabun New" w:cs="TH Sarabun New" w:eastAsia="TH Sarabun New" w:hAnsi="TH Sarabun New"/>
@@ -4386,7 +4386,7 @@
         </w:rPr>
         <w:t xml:space="preserve">โจทย์โปรเจกต์ฉบับง่าย (1 สัปดาห์): </w:t>
       </w:r>
-      <w:hyperlink w:history="1" r:id="rId5aup88ijglatoiq_dxufv">
+      <w:hyperlink w:history="1" r:id="rIdkcabsfp-oujlj69i5cwgw">
         <w:r>
           <w:rPr>
             <w:rFonts w:ascii="TH Sarabun New" w:cs="TH Sarabun New" w:eastAsia="TH Sarabun New" w:hAnsi="TH Sarabun New"/>

</xml_diff>